<commit_message>
Deliver A-level final project: multi-source collector, reporting web app, tests, CI/CD, and final report
</commit_message>
<xml_diff>
--- a/csca5028_final_project_submission/output/doc/CSCA5028_Final_Project_Report.docx
+++ b/csca5028_final_project_submission/output/doc/CSCA5028_Final_Project_Report.docx
@@ -10,6 +10,7 @@
         <w:t>CSCA 5028 Final Project Report</w:t>
       </w:r>
     </w:p>
+    <w:p/>
     <w:p>
       <w:pPr>
         <w:pStyle w:val="Heading2"/>
@@ -20,20 +21,36 @@
     </w:p>
     <w:p>
       <w:r>
-        <w:t>The '87 Land Cruiser Finder: Collector, Analyzer, and Event-Driven Collaboration</w:t>
+        <w:t>The '87 Land Cruiser Finder: Event-Driven Data Pipeline and Web Application</w:t>
       </w:r>
     </w:p>
+    <w:p/>
     <w:p>
       <w:pPr>
         <w:pStyle w:val="Heading2"/>
       </w:pPr>
       <w:r>
-        <w:t>1. High-level Description</w:t>
+        <w:t>1. Product Overview</w:t>
       </w:r>
     </w:p>
     <w:p>
       <w:r>
-        <w:t>This project builds a focused data product for 1987 Toyota Land Cruiser buyers and collectors. The system collects listing-related vehicle data from an external API, stores raw records in a shared database, runs analysis to produce summary insights, and exposes a deployed web interface for user interaction.</w:t>
+        <w:t>The project delivers a production-oriented system for collectors and buyers who want focused information about Toyota Land Cruiser inventory (with emphasis on classic years including 1987). The system continuously ingests vehicle-related data from external online APIs, stores raw records, computes analysis rollups, and serves results through a deployed web application and REST endpoints.</w:t>
+      </w:r>
+    </w:p>
+    <w:p/>
+    <w:p>
+      <w:r>
+        <w:t>The architecture intentionally separates responsibilities into independent processes:</w:t>
+      </w:r>
+    </w:p>
+    <w:p/>
+    <w:p>
+      <w:pPr>
+        <w:pStyle w:val="ListNumber"/>
+      </w:pPr>
+      <w:r>
+        <w:t>Web app (stateless HTTP process)</w:t>
       </w:r>
     </w:p>
     <w:p>
@@ -41,7 +58,7 @@
         <w:pStyle w:val="ListNumber"/>
       </w:pPr>
       <w:r>
-        <w:t>Web application (user-facing)</w:t>
+        <w:t>Data collector (scheduled ingestion from online sources)</w:t>
       </w:r>
     </w:p>
     <w:p>
@@ -49,7 +66,7 @@
         <w:pStyle w:val="ListNumber"/>
       </w:pPr>
       <w:r>
-        <w:t>Data collector (scheduled API ingestion)</w:t>
+        <w:t>Data analyzer (aggregation/rollups)</w:t>
       </w:r>
     </w:p>
     <w:p>
@@ -57,7 +74,7 @@
         <w:pStyle w:val="ListNumber"/>
       </w:pPr>
       <w:r>
-        <w:t>Data analyzer (aggregation and reporting)</w:t>
+        <w:t>Shared persistence (raw inventory database)</w:t>
       </w:r>
     </w:p>
     <w:p>
@@ -65,7 +82,338 @@
         <w:pStyle w:val="ListNumber"/>
       </w:pPr>
       <w:r>
-        <w:t>Shared persistence layer (raw + refined data backbone)</w:t>
+        <w:t>Event collaboration messaging (RabbitMQ producer/consumer)</w:t>
+      </w:r>
+    </w:p>
+    <w:p/>
+    <w:p>
+      <w:pPr>
+        <w:pStyle w:val="Heading2"/>
+      </w:pPr>
+      <w:r>
+        <w:t>2. Target Audience and Differentiation</w:t>
+      </w:r>
+    </w:p>
+    <w:p/>
+    <w:p>
+      <w:pPr>
+        <w:pStyle w:val="ListBullet"/>
+      </w:pPr>
+      <w:r>
+        <w:t>**Audience**: classic Land Cruiser buyers, collectors, and enthusiasts.</w:t>
+      </w:r>
+    </w:p>
+    <w:p>
+      <w:pPr>
+        <w:pStyle w:val="ListBullet"/>
+      </w:pPr>
+      <w:r>
+        <w:t>**Problem solved**: manually tracking inventory signals across sources is repetitive and error-prone.</w:t>
+      </w:r>
+    </w:p>
+    <w:p>
+      <w:pPr>
+        <w:pStyle w:val="ListBullet"/>
+      </w:pPr>
+      <w:r>
+        <w:t>**Differentiation**: combines focused vehicle-domain ingestion, analysis rollups, operational monitoring, and asynchronous event collaboration in one deployable pipeline.</w:t>
+      </w:r>
+    </w:p>
+    <w:p/>
+    <w:p>
+      <w:pPr>
+        <w:pStyle w:val="Heading2"/>
+      </w:pPr>
+      <w:r>
+        <w:t>3. High-Level Architecture</w:t>
+      </w:r>
+    </w:p>
+    <w:p/>
+    <w:p>
+      <w:pPr>
+        <w:pStyle w:val="NoSpacing"/>
+      </w:pPr>
+      <w:r>
+        <w:t xml:space="preserve">                     +------------------------------+</w:t>
+      </w:r>
+    </w:p>
+    <w:p>
+      <w:pPr>
+        <w:pStyle w:val="NoSpacing"/>
+      </w:pPr>
+      <w:r>
+        <w:t xml:space="preserve">                     |  External APIs (online)      |</w:t>
+      </w:r>
+    </w:p>
+    <w:p>
+      <w:pPr>
+        <w:pStyle w:val="NoSpacing"/>
+      </w:pPr>
+      <w:r>
+        <w:t xml:space="preserve">                     |  - NHTSA vPIC models         |</w:t>
+      </w:r>
+    </w:p>
+    <w:p>
+      <w:pPr>
+        <w:pStyle w:val="NoSpacing"/>
+      </w:pPr>
+      <w:r>
+        <w:t xml:space="preserve">                     |  - NHTSA recalls             |</w:t>
+      </w:r>
+    </w:p>
+    <w:p>
+      <w:pPr>
+        <w:pStyle w:val="NoSpacing"/>
+      </w:pPr>
+      <w:r>
+        <w:t xml:space="preserve">                     |  - FuelEconomy model menu    |</w:t>
+      </w:r>
+    </w:p>
+    <w:p>
+      <w:pPr>
+        <w:pStyle w:val="NoSpacing"/>
+      </w:pPr>
+      <w:r>
+        <w:t xml:space="preserve">                     +--------------+---------------+</w:t>
+      </w:r>
+    </w:p>
+    <w:p>
+      <w:pPr>
+        <w:pStyle w:val="NoSpacing"/>
+      </w:pPr>
+      <w:r>
+        <w:t xml:space="preserve">                                    |</w:t>
+      </w:r>
+    </w:p>
+    <w:p>
+      <w:pPr>
+        <w:pStyle w:val="NoSpacing"/>
+      </w:pPr>
+      <w:r>
+        <w:t xml:space="preserve">                                    v</w:t>
+      </w:r>
+    </w:p>
+    <w:p>
+      <w:pPr>
+        <w:pStyle w:val="NoSpacing"/>
+      </w:pPr>
+      <w:r>
+        <w:t xml:space="preserve">                     +------------------------------+</w:t>
+      </w:r>
+    </w:p>
+    <w:p>
+      <w:pPr>
+        <w:pStyle w:val="NoSpacing"/>
+      </w:pPr>
+      <w:r>
+        <w:t>Cron/Heroku Scheduler| Data Collector (independent) |</w:t>
+      </w:r>
+    </w:p>
+    <w:p>
+      <w:pPr>
+        <w:pStyle w:val="NoSpacing"/>
+      </w:pPr>
+      <w:r>
+        <w:t>--------------------&gt;| scripts/fetch_inventory.py   |</w:t>
+      </w:r>
+    </w:p>
+    <w:p>
+      <w:pPr>
+        <w:pStyle w:val="NoSpacing"/>
+      </w:pPr>
+      <w:r>
+        <w:t xml:space="preserve">                     +--------------+---------------+</w:t>
+      </w:r>
+    </w:p>
+    <w:p>
+      <w:pPr>
+        <w:pStyle w:val="NoSpacing"/>
+      </w:pPr>
+      <w:r>
+        <w:t xml:space="preserve">                                    |</w:t>
+      </w:r>
+    </w:p>
+    <w:p>
+      <w:pPr>
+        <w:pStyle w:val="NoSpacing"/>
+      </w:pPr>
+      <w:r>
+        <w:t xml:space="preserve">                                    v</w:t>
+      </w:r>
+    </w:p>
+    <w:p>
+      <w:pPr>
+        <w:pStyle w:val="NoSpacing"/>
+      </w:pPr>
+      <w:r>
+        <w:t xml:space="preserve">                     +------------------------------+</w:t>
+      </w:r>
+    </w:p>
+    <w:p>
+      <w:pPr>
+        <w:pStyle w:val="NoSpacing"/>
+      </w:pPr>
+      <w:r>
+        <w:t xml:space="preserve">                     | SQLite raw_inventory         |</w:t>
+      </w:r>
+    </w:p>
+    <w:p>
+      <w:pPr>
+        <w:pStyle w:val="NoSpacing"/>
+      </w:pPr>
+      <w:r>
+        <w:t xml:space="preserve">                     | (shared persistence backbone)|</w:t>
+      </w:r>
+    </w:p>
+    <w:p>
+      <w:pPr>
+        <w:pStyle w:val="NoSpacing"/>
+      </w:pPr>
+      <w:r>
+        <w:t xml:space="preserve">                     +----+---------------------+---+</w:t>
+      </w:r>
+    </w:p>
+    <w:p>
+      <w:pPr>
+        <w:pStyle w:val="NoSpacing"/>
+      </w:pPr>
+      <w:r>
+        <w:t xml:space="preserve">                          |                     |</w:t>
+      </w:r>
+    </w:p>
+    <w:p>
+      <w:pPr>
+        <w:pStyle w:val="NoSpacing"/>
+      </w:pPr>
+      <w:r>
+        <w:t xml:space="preserve">                          v                     v</w:t>
+      </w:r>
+    </w:p>
+    <w:p>
+      <w:pPr>
+        <w:pStyle w:val="NoSpacing"/>
+      </w:pPr>
+      <w:r>
+        <w:t xml:space="preserve">               +--------------------+   +------------------------+</w:t>
+      </w:r>
+    </w:p>
+    <w:p>
+      <w:pPr>
+        <w:pStyle w:val="NoSpacing"/>
+      </w:pPr>
+      <w:r>
+        <w:t xml:space="preserve">               | Data Analyzer       |   | RabbitMQ Broker       |</w:t>
+      </w:r>
+    </w:p>
+    <w:p>
+      <w:pPr>
+        <w:pStyle w:val="NoSpacing"/>
+      </w:pPr>
+      <w:r>
+        <w:t xml:space="preserve">               | scripts/analyze...  |   | inventory_events      |</w:t>
+      </w:r>
+    </w:p>
+    <w:p>
+      <w:pPr>
+        <w:pStyle w:val="NoSpacing"/>
+      </w:pPr>
+      <w:r>
+        <w:t xml:space="preserve">               +--------------------+   +------------------------+</w:t>
+      </w:r>
+    </w:p>
+    <w:p>
+      <w:pPr>
+        <w:pStyle w:val="NoSpacing"/>
+      </w:pPr>
+      <w:r>
+        <w:t xml:space="preserve">                                                 |</w:t>
+      </w:r>
+    </w:p>
+    <w:p>
+      <w:pPr>
+        <w:pStyle w:val="NoSpacing"/>
+      </w:pPr>
+      <w:r>
+        <w:t xml:space="preserve">                                                 v</w:t>
+      </w:r>
+    </w:p>
+    <w:p>
+      <w:pPr>
+        <w:pStyle w:val="NoSpacing"/>
+      </w:pPr>
+      <w:r>
+        <w:t xml:space="preserve">                                       Event consumer/downstream</w:t>
+      </w:r>
+    </w:p>
+    <w:p>
+      <w:pPr>
+        <w:pStyle w:val="NoSpacing"/>
+      </w:pPr>
+    </w:p>
+    <w:p>
+      <w:pPr>
+        <w:pStyle w:val="NoSpacing"/>
+      </w:pPr>
+      <w:r>
+        <w:t xml:space="preserve">                              +------------------------------+</w:t>
+      </w:r>
+    </w:p>
+    <w:p>
+      <w:pPr>
+        <w:pStyle w:val="NoSpacing"/>
+      </w:pPr>
+      <w:r>
+        <w:t>User/browser &lt;---------------&gt;| Web App (Flask, stateless)  |</w:t>
+      </w:r>
+    </w:p>
+    <w:p>
+      <w:pPr>
+        <w:pStyle w:val="NoSpacing"/>
+      </w:pPr>
+      <w:r>
+        <w:t xml:space="preserve">                              | /api/v1/inventory           |</w:t>
+      </w:r>
+    </w:p>
+    <w:p>
+      <w:pPr>
+        <w:pStyle w:val="NoSpacing"/>
+      </w:pPr>
+      <w:r>
+        <w:t xml:space="preserve">                              | /api/v1/summary             |</w:t>
+      </w:r>
+    </w:p>
+    <w:p>
+      <w:pPr>
+        <w:pStyle w:val="NoSpacing"/>
+      </w:pPr>
+      <w:r>
+        <w:t xml:space="preserve">                              | /health, /metrics           |</w:t>
+      </w:r>
+    </w:p>
+    <w:p>
+      <w:pPr>
+        <w:pStyle w:val="NoSpacing"/>
+      </w:pPr>
+      <w:r>
+        <w:t xml:space="preserve">                              +------------------------------+</w:t>
+      </w:r>
+    </w:p>
+    <w:p/>
+    <w:p>
+      <w:pPr>
+        <w:pStyle w:val="Heading3"/>
+      </w:pPr>
+      <w:r>
+        <w:t>Process and Trigger Discussion</w:t>
+      </w:r>
+    </w:p>
+    <w:p/>
+    <w:p>
+      <w:pPr>
+        <w:pStyle w:val="ListNumber"/>
+      </w:pPr>
+      <w:r>
+        <w:t>**Collector trigger**: periodic schedule (cron or Heroku Scheduler) runs `scripts/fetch_inventory.py`.</w:t>
       </w:r>
     </w:p>
     <w:p>
@@ -73,24 +421,7 @@
         <w:pStyle w:val="ListNumber"/>
       </w:pPr>
       <w:r>
-        <w:t>Event messaging channel (RabbitMQ) for decoupled service collaboration</w:t>
-      </w:r>
-    </w:p>
-    <w:p>
-      <w:pPr>
-        <w:pStyle w:val="Heading2"/>
-      </w:pPr>
-      <w:r>
-        <w:t>2. Whiteboard Architecture and Process Discussion</w:t>
-      </w:r>
-    </w:p>
-    <w:p>
-      <w:r>
-        <w:t>User -&gt; Web App (Flask, stateless) -&gt; SQLite/Post-process views</w:t>
-        <w:br/>
-        <w:t>Collector (NHTSA API pull) -&gt; raw_inventory table -&gt; Analyzer</w:t>
-        <w:br/>
-        <w:t>Collector -&gt; RabbitMQ (inventory_events) -&gt; Consumer/Downstream services</w:t>
+        <w:t>**Analyzer trigger**: can run on schedule (`scripts/analyze_data.py`) after collection.</w:t>
       </w:r>
     </w:p>
     <w:p>
@@ -98,7 +429,7 @@
         <w:pStyle w:val="ListNumber"/>
       </w:pPr>
       <w:r>
-        <w:t>Collector fetches Toyota model data from NHTSA vPIC and filters Land Cruiser records.</w:t>
+        <w:t>**Web app trigger**: user HTTP requests in real time.</w:t>
       </w:r>
     </w:p>
     <w:p>
@@ -106,7 +437,7 @@
         <w:pStyle w:val="ListNumber"/>
       </w:pPr>
       <w:r>
-        <w:t>Collector writes raw records into raw_inventory.</w:t>
+        <w:t>**Event trigger**: collector publishes `inventory.collection.completed` to RabbitMQ.</w:t>
       </w:r>
     </w:p>
     <w:p>
@@ -114,7 +445,189 @@
         <w:pStyle w:val="ListNumber"/>
       </w:pPr>
       <w:r>
-        <w:t>Analyzer reads raw records and computes rollups such as per-year counts and averages.</w:t>
+        <w:t>Each process can run, fail, and scale independently.</w:t>
+      </w:r>
+    </w:p>
+    <w:p/>
+    <w:p>
+      <w:pPr>
+        <w:pStyle w:val="Heading2"/>
+      </w:pPr>
+      <w:r>
+        <w:t>4. Key Design Decisions and Trade-offs</w:t>
+      </w:r>
+    </w:p>
+    <w:p/>
+    <w:p>
+      <w:pPr>
+        <w:pStyle w:val="Heading3"/>
+      </w:pPr>
+      <w:r>
+        <w:t>Decision A: Multi-source online ingestion</w:t>
+      </w:r>
+    </w:p>
+    <w:p>
+      <w:r>
+        <w:t>The collector fetches from multiple public online APIs (NHTSA models, NHTSA recalls, FuelEconomy model menu) instead of a single endpoint.</w:t>
+      </w:r>
+    </w:p>
+    <w:p/>
+    <w:p>
+      <w:pPr>
+        <w:pStyle w:val="ListBullet"/>
+      </w:pPr>
+      <w:r>
+        <w:t>**Why**: improves coverage and resilience when one source is sparse or temporarily unavailable.</w:t>
+      </w:r>
+    </w:p>
+    <w:p>
+      <w:pPr>
+        <w:pStyle w:val="ListBullet"/>
+      </w:pPr>
+      <w:r>
+        <w:t>**Trade-off**: requires source-specific parsing and normalized persistence schema.</w:t>
+      </w:r>
+    </w:p>
+    <w:p/>
+    <w:p>
+      <w:pPr>
+        <w:pStyle w:val="Heading3"/>
+      </w:pPr>
+      <w:r>
+        <w:t>Decision B: Shared persistent data store</w:t>
+      </w:r>
+    </w:p>
+    <w:p>
+      <w:r>
+        <w:t>All components write/read through `raw_inventory` in SQLite with an idempotent upsert key `(source, external_id, model_year)`.</w:t>
+      </w:r>
+    </w:p>
+    <w:p/>
+    <w:p>
+      <w:pPr>
+        <w:pStyle w:val="ListBullet"/>
+      </w:pPr>
+      <w:r>
+        <w:t>**Why**: straightforward local setup and deterministic reproducibility for grading.</w:t>
+      </w:r>
+    </w:p>
+    <w:p>
+      <w:pPr>
+        <w:pStyle w:val="ListBullet"/>
+      </w:pPr>
+      <w:r>
+        <w:t>**Trade-off**: SQLite is not ideal for high write concurrency compared to managed Postgres.</w:t>
+      </w:r>
+    </w:p>
+    <w:p/>
+    <w:p>
+      <w:pPr>
+        <w:pStyle w:val="Heading3"/>
+      </w:pPr>
+      <w:r>
+        <w:t>Decision C: Event collaboration via RabbitMQ</w:t>
+      </w:r>
+    </w:p>
+    <w:p>
+      <w:r>
+        <w:t>Collector publishes completion events and consumers subscribe asynchronously.</w:t>
+      </w:r>
+    </w:p>
+    <w:p/>
+    <w:p>
+      <w:pPr>
+        <w:pStyle w:val="ListBullet"/>
+      </w:pPr>
+      <w:r>
+        <w:t>**Why**: decouples producer and consumers; enables extensibility and non-blocking downstream processing.</w:t>
+      </w:r>
+    </w:p>
+    <w:p>
+      <w:pPr>
+        <w:pStyle w:val="ListBullet"/>
+      </w:pPr>
+      <w:r>
+        <w:t>**Trade-off**: eventual consistency and additional operational moving parts.</w:t>
+      </w:r>
+    </w:p>
+    <w:p/>
+    <w:p>
+      <w:pPr>
+        <w:pStyle w:val="Heading3"/>
+      </w:pPr>
+      <w:r>
+        <w:t>Decision D: Operational observability in web tier</w:t>
+      </w:r>
+    </w:p>
+    <w:p>
+      <w:r>
+        <w:t>The app exposes health and metrics endpoints (`/health`, `/metrics`) and request counters.</w:t>
+      </w:r>
+    </w:p>
+    <w:p/>
+    <w:p>
+      <w:pPr>
+        <w:pStyle w:val="ListBullet"/>
+      </w:pPr>
+      <w:r>
+        <w:t>**Why**: supports production monitoring and failure detection.</w:t>
+      </w:r>
+    </w:p>
+    <w:p>
+      <w:pPr>
+        <w:pStyle w:val="ListBullet"/>
+      </w:pPr>
+      <w:r>
+        <w:t>**Trade-off**: modest added implementation complexity.</w:t>
+      </w:r>
+    </w:p>
+    <w:p/>
+    <w:p>
+      <w:pPr>
+        <w:pStyle w:val="Heading3"/>
+      </w:pPr>
+      <w:r>
+        <w:t>Decision E: CI/CD automation</w:t>
+      </w:r>
+    </w:p>
+    <w:p>
+      <w:r>
+        <w:t>GitHub Actions workflows are included for CI tests and CD deploy flow to Heroku (secret-gated).</w:t>
+      </w:r>
+    </w:p>
+    <w:p/>
+    <w:p>
+      <w:pPr>
+        <w:pStyle w:val="ListBullet"/>
+      </w:pPr>
+      <w:r>
+        <w:t>**Why**: automates quality gates and repeatable releases.</w:t>
+      </w:r>
+    </w:p>
+    <w:p>
+      <w:pPr>
+        <w:pStyle w:val="ListBullet"/>
+      </w:pPr>
+      <w:r>
+        <w:t>**Trade-off**: requires secret management and platform setup.</w:t>
+      </w:r>
+    </w:p>
+    <w:p/>
+    <w:p>
+      <w:pPr>
+        <w:pStyle w:val="Heading2"/>
+      </w:pPr>
+      <w:r>
+        <w:t>5. Requirements and Testability</w:t>
+      </w:r>
+    </w:p>
+    <w:p/>
+    <w:p>
+      <w:pPr>
+        <w:pStyle w:val="Heading3"/>
+      </w:pPr>
+      <w:r>
+        <w:t>User Requirements</w:t>
       </w:r>
     </w:p>
     <w:p>
@@ -122,7 +635,7 @@
         <w:pStyle w:val="ListNumber"/>
       </w:pPr>
       <w:r>
-        <w:t>Collector optionally publishes an inventory.collection.completed event to RabbitMQ.</w:t>
+        <w:t>User can view a web report of Land Cruiser inventory and filter by year/model text.</w:t>
       </w:r>
     </w:p>
     <w:p>
@@ -130,7 +643,7 @@
         <w:pStyle w:val="ListNumber"/>
       </w:pPr>
       <w:r>
-        <w:t>Consumer services subscribe to the queue and react asynchronously.</w:t>
+        <w:t>User can access API endpoints for inventory and summary.</w:t>
       </w:r>
     </w:p>
     <w:p>
@@ -138,41 +651,167 @@
         <w:pStyle w:val="ListNumber"/>
       </w:pPr>
       <w:r>
-        <w:t>Web app serves user requests and runs independently from collector/analyzer.</w:t>
+        <w:t>User can verify the app is healthy and monitored in production.</w:t>
       </w:r>
     </w:p>
+    <w:p/>
+    <w:p>
+      <w:pPr>
+        <w:pStyle w:val="Heading3"/>
+      </w:pPr>
+      <w:r>
+        <w:t>System Requirements</w:t>
+      </w:r>
+    </w:p>
+    <w:p>
+      <w:pPr>
+        <w:pStyle w:val="ListNumber"/>
+      </w:pPr>
+      <w:r>
+        <w:t>Collector must fetch data from external online APIs.</w:t>
+      </w:r>
+    </w:p>
+    <w:p>
+      <w:pPr>
+        <w:pStyle w:val="ListNumber"/>
+      </w:pPr>
+      <w:r>
+        <w:t>Collector must store normalized raw records in shared persistence.</w:t>
+      </w:r>
+    </w:p>
+    <w:p>
+      <w:pPr>
+        <w:pStyle w:val="ListNumber"/>
+      </w:pPr>
+      <w:r>
+        <w:t>Analyzer must compute rollup summaries.</w:t>
+      </w:r>
+    </w:p>
+    <w:p>
+      <w:pPr>
+        <w:pStyle w:val="ListNumber"/>
+      </w:pPr>
+      <w:r>
+        <w:t>Event collaboration messaging must be supported through a broker.</w:t>
+      </w:r>
+    </w:p>
+    <w:p>
+      <w:pPr>
+        <w:pStyle w:val="ListNumber"/>
+      </w:pPr>
+      <w:r>
+        <w:t>CI test automation must run on code changes.</w:t>
+      </w:r>
+    </w:p>
+    <w:p>
+      <w:pPr>
+        <w:pStyle w:val="ListNumber"/>
+      </w:pPr>
+      <w:r>
+        <w:t>CD path must exist for production deployment.</w:t>
+      </w:r>
+    </w:p>
+    <w:p/>
     <w:p>
       <w:pPr>
         <w:pStyle w:val="Heading2"/>
       </w:pPr>
       <w:r>
-        <w:t>3. Design Decisions and Justifications</w:t>
+        <w:t>6. A-Level Rubric Traceability Matrix</w:t>
       </w:r>
     </w:p>
+    <w:p/>
     <w:p>
-      <w:pPr>
-        <w:pStyle w:val="Heading3"/>
-      </w:pPr>
       <w:r>
-        <w:t>Decision A: Request/Response for external data fetch</w:t>
+        <w:t>| A-Level Rubric Item | Implementation Evidence |</w:t>
       </w:r>
     </w:p>
     <w:p>
       <w:r>
-        <w:t>The collector uses direct REST calls to NHTSA because collection requires explicit pull semantics and deterministic input windows by year.</w:t>
-      </w:r>
-    </w:p>
-    <w:p>
-      <w:pPr>
-        <w:pStyle w:val="Heading3"/>
-      </w:pPr>
-      <w:r>
-        <w:t>Decision B: Event Collaboration for cross-service notifications</w:t>
+        <w:t>|---|---|</w:t>
       </w:r>
     </w:p>
     <w:p>
       <w:r>
-        <w:t>The system adds RabbitMQ event publication after each collection run. The producer announces facts, the broker buffers, and consumers react independently.</w:t>
+        <w:t>| Web application basic form + reporting | `csca5028-webapp-echo/templates/index.html` (interaction form + reporting table + summary cards) |</w:t>
+      </w:r>
+    </w:p>
+    <w:p>
+      <w:r>
+        <w:t>| Data collection | `csca5028-land-cruiser-data-collection/scripts/fetch_inventory.py` |</w:t>
+      </w:r>
+    </w:p>
+    <w:p>
+      <w:r>
+        <w:t>| Data analyzer | `csca5028-land-cruiser-data-collection/scripts/analyze_data.py` |</w:t>
+      </w:r>
+    </w:p>
+    <w:p>
+      <w:r>
+        <w:t>| Unit tests | `csca5028-webapp-echo/tests/test_unit_input.py`, `csca5028-land-cruiser-data-collection/tests/test_fetch_inventory.py` |</w:t>
+      </w:r>
+    </w:p>
+    <w:p>
+      <w:r>
+        <w:t>| Data persistence | `raw_inventory` schema and migrations (`migrations/001_create_raw_inventory.sql`) |</w:t>
+      </w:r>
+    </w:p>
+    <w:p>
+      <w:r>
+        <w:t>| REST collaboration internal or API endpoint | Web app APIs: `/api/v1/inventory`, `/api/v1/summary` |</w:t>
+      </w:r>
+    </w:p>
+    <w:p>
+      <w:r>
+        <w:t>| Product environment | Heroku deployment URL (public production host) |</w:t>
+      </w:r>
+    </w:p>
+    <w:p>
+      <w:r>
+        <w:t>| Integration tests | `csca5028-webapp-echo/tests/test_integration_app.py` |</w:t>
+      </w:r>
+    </w:p>
+    <w:p>
+      <w:r>
+        <w:t>| Mock objects / test doubles | Mocked summary test in `test_integration_app.py` and monkeypatched collector tests |</w:t>
+      </w:r>
+    </w:p>
+    <w:p>
+      <w:r>
+        <w:t>| Continuous integration | `.github/workflows/ci.yml` |</w:t>
+      </w:r>
+    </w:p>
+    <w:p>
+      <w:r>
+        <w:t>| Production monitoring instrumenting | `/health` and `/metrics` in `src/app.py` |</w:t>
+      </w:r>
+    </w:p>
+    <w:p>
+      <w:r>
+        <w:t>| Event collaboration messaging | `collector/eventing.py`, `scripts/consume_inventory_events.py` |</w:t>
+      </w:r>
+    </w:p>
+    <w:p>
+      <w:r>
+        <w:t>| Continuous delivery | `.github/workflows/cd.yml` (Heroku secret-gated deploy) |</w:t>
+      </w:r>
+    </w:p>
+    <w:p/>
+    <w:p>
+      <w:pPr>
+        <w:pStyle w:val="Heading2"/>
+      </w:pPr>
+      <w:r>
+        <w:t>7. Validation Summary</w:t>
+      </w:r>
+    </w:p>
+    <w:p/>
+    <w:p>
+      <w:pPr>
+        <w:pStyle w:val="ListBullet"/>
+      </w:pPr>
+      <w:r>
+        <w:t>Web app tests: **11 passed**.</w:t>
       </w:r>
     </w:p>
     <w:p>
@@ -180,7 +819,7 @@
         <w:pStyle w:val="ListBullet"/>
       </w:pPr>
       <w:r>
-        <w:t>Reduces temporal coupling between collector and downstream actions.</w:t>
+        <w:t>Collector tests: **3 passed**.</w:t>
       </w:r>
     </w:p>
     <w:p>
@@ -188,7 +827,7 @@
         <w:pStyle w:val="ListBullet"/>
       </w:pPr>
       <w:r>
-        <w:t>Improves extensibility because new consumers can be added without changing collector logic.</w:t>
+        <w:t>Multi-source collection run verified with inserts and per-source counts.</w:t>
       </w:r>
     </w:p>
     <w:p>
@@ -196,317 +835,80 @@
         <w:pStyle w:val="ListBullet"/>
       </w:pPr>
       <w:r>
-        <w:t>Improves resilience during spikes or temporary consumer downtime.</w:t>
-      </w:r>
-    </w:p>
-    <w:p>
-      <w:r>
-        <w:t>Trade-offs: eventual consistency and more complex debugging, mitigated by structured payloads and correlation IDs.</w:t>
+        <w:t>Analyzer outputs total counts, year distribution, top models, and per-source distribution.</w:t>
       </w:r>
     </w:p>
     <w:p>
       <w:pPr>
-        <w:pStyle w:val="Heading3"/>
+        <w:pStyle w:val="ListBullet"/>
       </w:pPr>
       <w:r>
-        <w:t>Decision C: SQLite for current scope</w:t>
+        <w:t>Deployed app exposes reporting UI and operational endpoints.</w:t>
       </w:r>
     </w:p>
-    <w:p>
-      <w:r>
-        <w:t>SQLite was selected for a lightweight footprint and fast setup. Schema migrations are versioned for repeatability.</w:t>
-      </w:r>
-    </w:p>
-    <w:p>
-      <w:pPr>
-        <w:pStyle w:val="Heading3"/>
-      </w:pPr>
-      <w:r>
-        <w:t>Decision D: Stateless web app with health endpoint</w:t>
-      </w:r>
-    </w:p>
-    <w:p>
-      <w:r>
-        <w:t>The web app is stateless and exposes /health for production monitoring and safe deployment checks.</w:t>
-      </w:r>
-    </w:p>
+    <w:p/>
     <w:p>
       <w:pPr>
         <w:pStyle w:val="Heading2"/>
       </w:pPr>
       <w:r>
-        <w:t>4. System Requirements and Testability</w:t>
+        <w:t>8. Deployment and Submission Artifacts</w:t>
       </w:r>
     </w:p>
-    <w:tbl>
-      <w:tblPr>
-        <w:tblW w:type="auto" w:w="0"/>
-        <w:tblLook w:firstColumn="1" w:firstRow="1" w:lastColumn="0" w:lastRow="0" w:noHBand="0" w:noVBand="1" w:val="04A0"/>
-      </w:tblPr>
-      <w:tblGrid>
-        <w:gridCol w:w="2880"/>
-        <w:gridCol w:w="2880"/>
-        <w:gridCol w:w="2880"/>
-      </w:tblGrid>
-      <w:tr>
-        <w:tc>
-          <w:tcPr>
-            <w:tcW w:type="dxa" w:w="2880"/>
-          </w:tcPr>
-          <w:p>
-            <w:r>
-              <w:t>Requirement</w:t>
-            </w:r>
-          </w:p>
-        </w:tc>
-        <w:tc>
-          <w:tcPr>
-            <w:tcW w:type="dxa" w:w="2880"/>
-          </w:tcPr>
-          <w:p>
-            <w:r>
-              <w:t>How It Is Tested</w:t>
-            </w:r>
-          </w:p>
-        </w:tc>
-        <w:tc>
-          <w:tcPr>
-            <w:tcW w:type="dxa" w:w="2880"/>
-          </w:tcPr>
-          <w:p>
-            <w:r>
-              <w:t>Evidence</w:t>
-            </w:r>
-          </w:p>
-        </w:tc>
-      </w:tr>
-      <w:tr>
-        <w:tc>
-          <w:tcPr>
-            <w:tcW w:type="dxa" w:w="2880"/>
-          </w:tcPr>
-          <w:p>
-            <w:r>
-              <w:t>System fetches external vehicle data</w:t>
-            </w:r>
-          </w:p>
-        </w:tc>
-        <w:tc>
-          <w:tcPr>
-            <w:tcW w:type="dxa" w:w="2880"/>
-          </w:tcPr>
-          <w:p>
-            <w:r>
-              <w:t>Run collector and verify fetch counts &gt; 0</w:t>
-            </w:r>
-          </w:p>
-        </w:tc>
-        <w:tc>
-          <w:tcPr>
-            <w:tcW w:type="dxa" w:w="2880"/>
-          </w:tcPr>
-          <w:p>
-            <w:r>
-              <w:t>Collector logs</w:t>
-            </w:r>
-          </w:p>
-        </w:tc>
-      </w:tr>
-      <w:tr>
-        <w:tc>
-          <w:tcPr>
-            <w:tcW w:type="dxa" w:w="2880"/>
-          </w:tcPr>
-          <w:p>
-            <w:r>
-              <w:t>Raw data is persisted</w:t>
-            </w:r>
-          </w:p>
-        </w:tc>
-        <w:tc>
-          <w:tcPr>
-            <w:tcW w:type="dxa" w:w="2880"/>
-          </w:tcPr>
-          <w:p>
-            <w:r>
-              <w:t>Query raw_inventory after collection run</w:t>
-            </w:r>
-          </w:p>
-        </w:tc>
-        <w:tc>
-          <w:tcPr>
-            <w:tcW w:type="dxa" w:w="2880"/>
-          </w:tcPr>
-          <w:p>
-            <w:r>
-              <w:t>DB query output</w:t>
-            </w:r>
-          </w:p>
-        </w:tc>
-      </w:tr>
-      <w:tr>
-        <w:tc>
-          <w:tcPr>
-            <w:tcW w:type="dxa" w:w="2880"/>
-          </w:tcPr>
-          <w:p>
-            <w:r>
-              <w:t>Analysis computes rollups</w:t>
-            </w:r>
-          </w:p>
-        </w:tc>
-        <w:tc>
-          <w:tcPr>
-            <w:tcW w:type="dxa" w:w="2880"/>
-          </w:tcPr>
-          <w:p>
-            <w:r>
-              <w:t>Run analyzer and verify summary output</w:t>
-            </w:r>
-          </w:p>
-        </w:tc>
-        <w:tc>
-          <w:tcPr>
-            <w:tcW w:type="dxa" w:w="2880"/>
-          </w:tcPr>
-          <w:p>
-            <w:r>
-              <w:t>Analyzer logs</w:t>
-            </w:r>
-          </w:p>
-        </w:tc>
-      </w:tr>
-      <w:tr>
-        <w:tc>
-          <w:tcPr>
-            <w:tcW w:type="dxa" w:w="2880"/>
-          </w:tcPr>
-          <w:p>
-            <w:r>
-              <w:t>Web app accepts input and responds</w:t>
-            </w:r>
-          </w:p>
-        </w:tc>
-        <w:tc>
-          <w:tcPr>
-            <w:tcW w:type="dxa" w:w="2880"/>
-          </w:tcPr>
-          <w:p>
-            <w:r>
-              <w:t>Integration test against /echo</w:t>
-            </w:r>
-          </w:p>
-        </w:tc>
-        <w:tc>
-          <w:tcPr>
-            <w:tcW w:type="dxa" w:w="2880"/>
-          </w:tcPr>
-          <w:p>
-            <w:r>
-              <w:t>pytest results</w:t>
-            </w:r>
-          </w:p>
-        </w:tc>
-      </w:tr>
-      <w:tr>
-        <w:tc>
-          <w:tcPr>
-            <w:tcW w:type="dxa" w:w="2880"/>
-          </w:tcPr>
-          <w:p>
-            <w:r>
-              <w:t>Web app exposes service health</w:t>
-            </w:r>
-          </w:p>
-        </w:tc>
-        <w:tc>
-          <w:tcPr>
-            <w:tcW w:type="dxa" w:w="2880"/>
-          </w:tcPr>
-          <w:p>
-            <w:r>
-              <w:t>GET /health returns HTTP 200 + {"status":"ok"}</w:t>
-            </w:r>
-          </w:p>
-        </w:tc>
-        <w:tc>
-          <w:tcPr>
-            <w:tcW w:type="dxa" w:w="2880"/>
-          </w:tcPr>
-          <w:p>
-            <w:r>
-              <w:t>curl and test output</w:t>
-            </w:r>
-          </w:p>
-        </w:tc>
-      </w:tr>
-      <w:tr>
-        <w:tc>
-          <w:tcPr>
-            <w:tcW w:type="dxa" w:w="2880"/>
-          </w:tcPr>
-          <w:p>
-            <w:r>
-              <w:t>Asynchronous collaboration is available</w:t>
-            </w:r>
-          </w:p>
-        </w:tc>
-        <w:tc>
-          <w:tcPr>
-            <w:tcW w:type="dxa" w:w="2880"/>
-          </w:tcPr>
-          <w:p>
-            <w:r>
-              <w:t>Enable event publishing and consume queue messages</w:t>
-            </w:r>
-          </w:p>
-        </w:tc>
-        <w:tc>
-          <w:tcPr>
-            <w:tcW w:type="dxa" w:w="2880"/>
-          </w:tcPr>
-          <w:p>
-            <w:r>
-              <w:t>Consumer output</w:t>
-            </w:r>
-          </w:p>
-        </w:tc>
-      </w:tr>
-    </w:tbl>
+    <w:p/>
+    <w:p>
+      <w:pPr>
+        <w:pStyle w:val="ListNumber"/>
+      </w:pPr>
+      <w:r>
+        <w:t xml:space="preserve">**Deployed URL**  </w:t>
+      </w:r>
+    </w:p>
+    <w:p>
+      <w:r>
+        <w:t xml:space="preserve">   `https://csca5028-echo-mb-final-0313-6f06d76737c3.herokuapp.com/`</w:t>
+      </w:r>
+    </w:p>
+    <w:p/>
+    <w:p>
+      <w:pPr>
+        <w:pStyle w:val="ListNumber"/>
+      </w:pPr>
+      <w:r>
+        <w:t xml:space="preserve">**Report file**  </w:t>
+      </w:r>
+    </w:p>
+    <w:p>
+      <w:r>
+        <w:t xml:space="preserve">   `csca5028_final_project_submission/output/doc/CSCA5028_Final_Project_Report.docx`</w:t>
+      </w:r>
+    </w:p>
+    <w:p/>
+    <w:p>
+      <w:pPr>
+        <w:pStyle w:val="ListNumber"/>
+      </w:pPr>
+      <w:r>
+        <w:t xml:space="preserve">**Source code zip**  </w:t>
+      </w:r>
+    </w:p>
+    <w:p>
+      <w:r>
+        <w:t xml:space="preserve">   `csca5028-final-project-source-a-level-20260313.zip`</w:t>
+      </w:r>
+    </w:p>
+    <w:p/>
     <w:p>
       <w:pPr>
         <w:pStyle w:val="Heading2"/>
       </w:pPr>
       <w:r>
-        <w:t>5. Deployment and Submission Artifacts</w:t>
+        <w:t>9. Conclusion</w:t>
       </w:r>
     </w:p>
     <w:p>
       <w:r>
-        <w:t>Deployed URL: https://csca5028-echo-mb-final-0313-6f06d76737c3.herokuapp.com/</w:t>
-      </w:r>
-    </w:p>
-    <w:p>
-      <w:r>
-        <w:t>Report file: CSCA5028_Final_Project_Report.docx</w:t>
-      </w:r>
-    </w:p>
-    <w:p>
-      <w:r>
-        <w:t>Source code ZIP: csca5028-final-project-source-clean-20260313.zip</w:t>
-      </w:r>
-    </w:p>
-    <w:p>
-      <w:pPr>
-        <w:pStyle w:val="Heading2"/>
-      </w:pPr>
-      <w:r>
-        <w:t>6. Conclusion</w:t>
-      </w:r>
-    </w:p>
-    <w:p>
-      <w:r>
-        <w:t>The final system demonstrates separated processes (collector, analyzer, web app), shared persistence, and event collaboration. The architecture balances simplicity with scalable communication patterns for distributed systems.</w:t>
+        <w:t>The final system demonstrates a complete, production-oriented architecture aligned to the course rubric: independent web/collector/analyzer processes, shared persistence, API exposure, monitoring instrumentation, automated tests, CI/CD workflows, and event collaboration messaging. This design is intentionally pragmatic for an academic capstone while still representing real distributed system patterns.</w:t>
       </w:r>
     </w:p>
     <w:sectPr>

</xml_diff>

<commit_message>
Refresh final report docx for listing-focused scope
</commit_message>
<xml_diff>
--- a/csca5028_final_project_submission/output/doc/CSCA5028_Final_Project_Report.docx
+++ b/csca5028_final_project_submission/output/doc/CSCA5028_Final_Project_Report.docx
@@ -35,7 +35,7 @@
     </w:p>
     <w:p>
       <w:r>
-        <w:t>The project delivers a production-oriented system for collectors and buyers who want focused information about Toyota Land Cruiser inventory (with emphasis on classic years including 1987). The system continuously ingests vehicle-related data from external online APIs, stores raw records, computes analysis rollups, and serves results through a deployed web application and REST endpoints.</w:t>
+        <w:t>The project delivers a production-oriented system for collectors and buyers who want focused information about actual Toyota Land Cruiser listing opportunities (with strict emphasis on model year 1987 in the deployed web app). The system continuously ingests listing and vehicle-context data from external online sources, stores raw records, computes analysis rollups, and serves results through a deployed web application and REST endpoints.</w:t>
       </w:r>
     </w:p>
     <w:p/>
@@ -100,7 +100,7 @@
         <w:pStyle w:val="ListBullet"/>
       </w:pPr>
       <w:r>
-        <w:t>**Audience**: classic Land Cruiser buyers, collectors, and enthusiasts.</w:t>
+        <w:t>Audience: classic Land Cruiser buyers, collectors, and enthusiasts.</w:t>
       </w:r>
     </w:p>
     <w:p>
@@ -108,7 +108,7 @@
         <w:pStyle w:val="ListBullet"/>
       </w:pPr>
       <w:r>
-        <w:t>**Problem solved**: manually tracking inventory signals across sources is repetitive and error-prone.</w:t>
+        <w:t>Problem solved: manually tracking inventory signals across sources is repetitive and error-prone.</w:t>
       </w:r>
     </w:p>
     <w:p>
@@ -116,7 +116,7 @@
         <w:pStyle w:val="ListBullet"/>
       </w:pPr>
       <w:r>
-        <w:t>**Differentiation**: combines focused vehicle-domain ingestion, analysis rollups, operational monitoring, and asynchronous event collaboration in one deployable pipeline.</w:t>
+        <w:t>Differentiation: combines focused vehicle-domain ingestion, analysis rollups, operational monitoring, and asynchronous event collaboration in one deployable pipeline.</w:t>
       </w:r>
     </w:p>
     <w:p/>
@@ -134,7 +134,7 @@
         <w:pStyle w:val="NoSpacing"/>
       </w:pPr>
       <w:r>
-        <w:t xml:space="preserve">                     +------------------------------+</w:t>
+        <w:t xml:space="preserve">                     +-------------------------------------------+</w:t>
       </w:r>
     </w:p>
     <w:p>
@@ -142,7 +142,7 @@
         <w:pStyle w:val="NoSpacing"/>
       </w:pPr>
       <w:r>
-        <w:t xml:space="preserve">                     |  External APIs (online)      |</w:t>
+        <w:t xml:space="preserve">                     |  External Online Sources                  |</w:t>
       </w:r>
     </w:p>
     <w:p>
@@ -150,7 +150,7 @@
         <w:pStyle w:val="NoSpacing"/>
       </w:pPr>
       <w:r>
-        <w:t xml:space="preserve">                     |  - NHTSA vPIC models         |</w:t>
+        <w:t xml:space="preserve">                     |  - Bring a Trailer (auction listings)     |</w:t>
       </w:r>
     </w:p>
     <w:p>
@@ -158,7 +158,7 @@
         <w:pStyle w:val="NoSpacing"/>
       </w:pPr>
       <w:r>
-        <w:t xml:space="preserve">                     |  - NHTSA recalls             |</w:t>
+        <w:t xml:space="preserve">                     |  - ClassicCars.com (classified listings)  |</w:t>
       </w:r>
     </w:p>
     <w:p>
@@ -166,7 +166,7 @@
         <w:pStyle w:val="NoSpacing"/>
       </w:pPr>
       <w:r>
-        <w:t xml:space="preserve">                     |  - FuelEconomy model menu    |</w:t>
+        <w:t xml:space="preserve">                     |  - NHTSA/FuelEconomy (context signals)    |</w:t>
       </w:r>
     </w:p>
     <w:p>
@@ -174,7 +174,7 @@
         <w:pStyle w:val="NoSpacing"/>
       </w:pPr>
       <w:r>
-        <w:t xml:space="preserve">                     +--------------+---------------+</w:t>
+        <w:t xml:space="preserve">                     +-------------------+-----------------------+</w:t>
       </w:r>
     </w:p>
     <w:p>
@@ -413,7 +413,7 @@
         <w:pStyle w:val="ListNumber"/>
       </w:pPr>
       <w:r>
-        <w:t>**Collector trigger**: periodic schedule (cron or Heroku Scheduler) runs `scripts/fetch_inventory.py`.</w:t>
+        <w:t>Collector trigger: periodic schedule (cron or Heroku Scheduler) runs scripts/fetch_inventory.py.</w:t>
       </w:r>
     </w:p>
     <w:p>
@@ -421,7 +421,7 @@
         <w:pStyle w:val="ListNumber"/>
       </w:pPr>
       <w:r>
-        <w:t>**Analyzer trigger**: can run on schedule (`scripts/analyze_data.py`) after collection.</w:t>
+        <w:t>Analyzer trigger: can run on schedule (scripts/analyze_data.py) after collection.</w:t>
       </w:r>
     </w:p>
     <w:p>
@@ -429,7 +429,7 @@
         <w:pStyle w:val="ListNumber"/>
       </w:pPr>
       <w:r>
-        <w:t>**Web app trigger**: user HTTP requests in real time.</w:t>
+        <w:t>Web app trigger: user HTTP requests in real time.</w:t>
       </w:r>
     </w:p>
     <w:p>
@@ -437,7 +437,7 @@
         <w:pStyle w:val="ListNumber"/>
       </w:pPr>
       <w:r>
-        <w:t>**Event trigger**: collector publishes `inventory.collection.completed` to RabbitMQ.</w:t>
+        <w:t>Event trigger: collector publishes inventory.collection.completed to RabbitMQ.</w:t>
       </w:r>
     </w:p>
     <w:p>
@@ -468,7 +468,7 @@
     </w:p>
     <w:p>
       <w:r>
-        <w:t>The collector fetches from multiple public online APIs (NHTSA models, NHTSA recalls, FuelEconomy model menu) instead of a single endpoint.</w:t>
+        <w:t>The collector fetches from multiple online sources (Bring a Trailer listings, ClassicCars.com listings, plus NHTSA/FuelEconomy contextual APIs) instead of a single endpoint.</w:t>
       </w:r>
     </w:p>
     <w:p/>
@@ -477,7 +477,7 @@
         <w:pStyle w:val="ListBullet"/>
       </w:pPr>
       <w:r>
-        <w:t>**Why**: improves coverage and resilience when one source is sparse or temporarily unavailable.</w:t>
+        <w:t>Why: improves coverage and resilience when one source is sparse or temporarily unavailable.</w:t>
       </w:r>
     </w:p>
     <w:p>
@@ -485,7 +485,7 @@
         <w:pStyle w:val="ListBullet"/>
       </w:pPr>
       <w:r>
-        <w:t>**Trade-off**: requires source-specific parsing and normalized persistence schema.</w:t>
+        <w:t>Trade-off: requires source-specific parsing and normalized persistence schema.</w:t>
       </w:r>
     </w:p>
     <w:p/>
@@ -499,7 +499,7 @@
     </w:p>
     <w:p>
       <w:r>
-        <w:t>All components write/read through `raw_inventory` in SQLite with an idempotent upsert key `(source, external_id, model_year)`.</w:t>
+        <w:t>All components write/read through raw_inventory in SQLite with an idempotent upsert key (source, external_id, model_year).</w:t>
       </w:r>
     </w:p>
     <w:p/>
@@ -508,7 +508,7 @@
         <w:pStyle w:val="ListBullet"/>
       </w:pPr>
       <w:r>
-        <w:t>**Why**: straightforward local setup and deterministic reproducibility for grading.</w:t>
+        <w:t>Why: straightforward local setup and deterministic reproducibility for grading.</w:t>
       </w:r>
     </w:p>
     <w:p>
@@ -516,7 +516,7 @@
         <w:pStyle w:val="ListBullet"/>
       </w:pPr>
       <w:r>
-        <w:t>**Trade-off**: SQLite is not ideal for high write concurrency compared to managed Postgres.</w:t>
+        <w:t>Trade-off: SQLite is not ideal for high write concurrency compared to managed Postgres.</w:t>
       </w:r>
     </w:p>
     <w:p/>
@@ -539,7 +539,7 @@
         <w:pStyle w:val="ListBullet"/>
       </w:pPr>
       <w:r>
-        <w:t>**Why**: decouples producer and consumers; enables extensibility and non-blocking downstream processing.</w:t>
+        <w:t>Why: decouples producer and consumers; enables extensibility and non-blocking downstream processing.</w:t>
       </w:r>
     </w:p>
     <w:p>
@@ -547,7 +547,7 @@
         <w:pStyle w:val="ListBullet"/>
       </w:pPr>
       <w:r>
-        <w:t>**Trade-off**: eventual consistency and additional operational moving parts.</w:t>
+        <w:t>Trade-off: eventual consistency and additional operational moving parts.</w:t>
       </w:r>
     </w:p>
     <w:p/>
@@ -561,7 +561,7 @@
     </w:p>
     <w:p>
       <w:r>
-        <w:t>The app exposes health and metrics endpoints (`/health`, `/metrics`) and request counters.</w:t>
+        <w:t>The app exposes health and metrics endpoints (/health, /metrics) and request counters.</w:t>
       </w:r>
     </w:p>
     <w:p/>
@@ -570,7 +570,7 @@
         <w:pStyle w:val="ListBullet"/>
       </w:pPr>
       <w:r>
-        <w:t>**Why**: supports production monitoring and failure detection.</w:t>
+        <w:t>Why: supports production monitoring and failure detection.</w:t>
       </w:r>
     </w:p>
     <w:p>
@@ -578,7 +578,7 @@
         <w:pStyle w:val="ListBullet"/>
       </w:pPr>
       <w:r>
-        <w:t>**Trade-off**: modest added implementation complexity.</w:t>
+        <w:t>Trade-off: modest added implementation complexity.</w:t>
       </w:r>
     </w:p>
     <w:p/>
@@ -601,7 +601,7 @@
         <w:pStyle w:val="ListBullet"/>
       </w:pPr>
       <w:r>
-        <w:t>**Why**: automates quality gates and repeatable releases.</w:t>
+        <w:t>Why: automates quality gates and repeatable releases.</w:t>
       </w:r>
     </w:p>
     <w:p>
@@ -609,7 +609,7 @@
         <w:pStyle w:val="ListBullet"/>
       </w:pPr>
       <w:r>
-        <w:t>**Trade-off**: requires secret management and platform setup.</w:t>
+        <w:t>Trade-off: requires secret management and platform setup.</w:t>
       </w:r>
     </w:p>
     <w:p/>
@@ -668,7 +668,7 @@
         <w:pStyle w:val="ListNumber"/>
       </w:pPr>
       <w:r>
-        <w:t>Collector must fetch data from external online APIs.</w:t>
+        <w:t>Collector must fetch data from external online sources (including real listing sources).</w:t>
       </w:r>
     </w:p>
     <w:p>
@@ -733,32 +733,32 @@
     </w:p>
     <w:p>
       <w:r>
-        <w:t>| Web application basic form + reporting | `csca5028-webapp-echo/templates/index.html` (interaction form + reporting table + summary cards) |</w:t>
+        <w:t>| Web application basic form + reporting | csca5028-webapp-echo/templates/index.html (interaction form + reporting table + summary cards) |</w:t>
       </w:r>
     </w:p>
     <w:p>
       <w:r>
-        <w:t>| Data collection | `csca5028-land-cruiser-data-collection/scripts/fetch_inventory.py` |</w:t>
+        <w:t>| Data collection | csca5028-land-cruiser-data-collection/scripts/fetch_inventory.py |</w:t>
       </w:r>
     </w:p>
     <w:p>
       <w:r>
-        <w:t>| Data analyzer | `csca5028-land-cruiser-data-collection/scripts/analyze_data.py` |</w:t>
+        <w:t>| Data analyzer | csca5028-land-cruiser-data-collection/scripts/analyze_data.py |</w:t>
       </w:r>
     </w:p>
     <w:p>
       <w:r>
-        <w:t>| Unit tests | `csca5028-webapp-echo/tests/test_unit_input.py`, `csca5028-land-cruiser-data-collection/tests/test_fetch_inventory.py` |</w:t>
+        <w:t>| Unit tests | csca5028-webapp-echo/tests/test_unit_input.py, csca5028-land-cruiser-data-collection/tests/test_fetch_inventory.py |</w:t>
       </w:r>
     </w:p>
     <w:p>
       <w:r>
-        <w:t>| Data persistence | `raw_inventory` schema and migrations (`migrations/001_create_raw_inventory.sql`) |</w:t>
+        <w:t>| Data persistence | raw_inventory schema and migrations (migrations/001_create_raw_inventory.sql) |</w:t>
       </w:r>
     </w:p>
     <w:p>
       <w:r>
-        <w:t>| REST collaboration internal or API endpoint | Web app APIs: `/api/v1/inventory`, `/api/v1/summary` |</w:t>
+        <w:t>| REST collaboration internal or API endpoint | Web app APIs: /api/v1/inventory, /api/v1/summary |</w:t>
       </w:r>
     </w:p>
     <w:p>
@@ -768,32 +768,32 @@
     </w:p>
     <w:p>
       <w:r>
-        <w:t>| Integration tests | `csca5028-webapp-echo/tests/test_integration_app.py` |</w:t>
+        <w:t>| Integration tests | csca5028-webapp-echo/tests/test_integration_app.py |</w:t>
       </w:r>
     </w:p>
     <w:p>
       <w:r>
-        <w:t>| Mock objects / test doubles | Mocked summary test in `test_integration_app.py` and monkeypatched collector tests |</w:t>
+        <w:t>| Mock objects / test doubles | Mocked summary test in test_integration_app.py and monkeypatched collector tests |</w:t>
       </w:r>
     </w:p>
     <w:p>
       <w:r>
-        <w:t>| Continuous integration | `.github/workflows/ci.yml` |</w:t>
+        <w:t>| Continuous integration | .github/workflows/ci.yml |</w:t>
       </w:r>
     </w:p>
     <w:p>
       <w:r>
-        <w:t>| Production monitoring instrumenting | `/health` and `/metrics` in `src/app.py` |</w:t>
+        <w:t>| Production monitoring instrumenting | /health and /metrics in src/app.py |</w:t>
       </w:r>
     </w:p>
     <w:p>
       <w:r>
-        <w:t>| Event collaboration messaging | `collector/eventing.py`, `scripts/consume_inventory_events.py` |</w:t>
+        <w:t>| Event collaboration messaging | collector/eventing.py, scripts/consume_inventory_events.py |</w:t>
       </w:r>
     </w:p>
     <w:p>
       <w:r>
-        <w:t>| Continuous delivery | `.github/workflows/cd.yml` (Heroku secret-gated deploy) |</w:t>
+        <w:t>| Continuous delivery | .github/workflows/cd.yml (Heroku secret-gated deploy) |</w:t>
       </w:r>
     </w:p>
     <w:p/>
@@ -811,7 +811,7 @@
         <w:pStyle w:val="ListBullet"/>
       </w:pPr>
       <w:r>
-        <w:t>Web app tests: **11 passed**.</w:t>
+        <w:t>Web app tests: 13 passed.</w:t>
       </w:r>
     </w:p>
     <w:p>
@@ -819,7 +819,7 @@
         <w:pStyle w:val="ListBullet"/>
       </w:pPr>
       <w:r>
-        <w:t>Collector tests: **3 passed**.</w:t>
+        <w:t>Collector tests: 5 passed.</w:t>
       </w:r>
     </w:p>
     <w:p>
@@ -827,7 +827,7 @@
         <w:pStyle w:val="ListBullet"/>
       </w:pPr>
       <w:r>
-        <w:t>Multi-source collection run verified with inserts and per-source counts.</w:t>
+        <w:t>Multi-source collection run verified with marketplace inserts and per-source counts.</w:t>
       </w:r>
     </w:p>
     <w:p>
@@ -861,12 +861,12 @@
         <w:pStyle w:val="ListNumber"/>
       </w:pPr>
       <w:r>
-        <w:t xml:space="preserve">**Deployed URL**  </w:t>
+        <w:t xml:space="preserve">Deployed URL  </w:t>
       </w:r>
     </w:p>
     <w:p>
       <w:r>
-        <w:t xml:space="preserve">   `https://csca5028-echo-mb-final-0313-6f06d76737c3.herokuapp.com/`</w:t>
+        <w:t xml:space="preserve">   https://csca5028-echo-mb-final-0313-6f06d76737c3.herokuapp.com/</w:t>
       </w:r>
     </w:p>
     <w:p/>
@@ -875,12 +875,12 @@
         <w:pStyle w:val="ListNumber"/>
       </w:pPr>
       <w:r>
-        <w:t xml:space="preserve">**Report file**  </w:t>
+        <w:t xml:space="preserve">Report file  </w:t>
       </w:r>
     </w:p>
     <w:p>
       <w:r>
-        <w:t xml:space="preserve">   `csca5028_final_project_submission/output/doc/CSCA5028_Final_Project_Report.docx`</w:t>
+        <w:t xml:space="preserve">   csca5028_final_project_submission/output/doc/CSCA5028_Final_Project_Report.docx</w:t>
       </w:r>
     </w:p>
     <w:p/>
@@ -889,12 +889,12 @@
         <w:pStyle w:val="ListNumber"/>
       </w:pPr>
       <w:r>
-        <w:t xml:space="preserve">**Source code zip**  </w:t>
+        <w:t xml:space="preserve">Source code zip  </w:t>
       </w:r>
     </w:p>
     <w:p>
       <w:r>
-        <w:t xml:space="preserve">   `csca5028-final-project-source-a-level-20260313.zip`</w:t>
+        <w:t xml:space="preserve">   csca5028-final-project-source-a-level-20260313.zip</w:t>
       </w:r>
     </w:p>
     <w:p/>

</xml_diff>